<commit_message>
Update T21RS testing kit docs and add scoring CSVs
</commit_message>
<xml_diff>
--- a/docs/T21RS_rubric_scoring_guide.docx
+++ b/docs/T21RS_rubric_scoring_guide.docx
@@ -36,26 +36,20 @@
         <w:spacing w:after="160" w:line="300" w:lineRule="exact"/>
       </w:pPr>
       <w:r>
-        <w:t xml:space="preserve">Score every query (Track A, calibration, and wild) on the four dimensions below using a </w:t>
+        <w:t>Score every query (Track A, calibration, and wild) on the four dimensions below using a 1–5 integer scale, plus the binary hallucination flag. Record in your own scoring CSV (T21RS_scores_&lt;lastname&gt;.csv in docs/scores/ of the repo) – it is pre-filled with your assigned queries, calibration rows, and wild-track placeholders; just add scores and dates. One row per query.</w:t>
       </w:r>
       <w:r>
         <w:rPr>
           <w:b/>
         </w:rPr>
-        <w:t>1–5 integer scale</w:t>
       </w:r>
-      <w:r>
-        <w:t xml:space="preserve">, plus the binary hallucination flag. Record in </w:t>
-      </w:r>
+      <w:r/>
       <w:r>
         <w:rPr>
           <w:rFonts w:ascii="Consolas" w:hAnsi="Consolas"/>
         </w:rPr>
-        <w:t>T21RS_scored_queries.csv</w:t>
       </w:r>
-      <w:r>
-        <w:t>. One row per query.</w:t>
-      </w:r>
+      <w:r/>
     </w:p>
     <w:p>
       <w:pPr>
@@ -1593,7 +1587,7 @@
         <w:spacing w:after="160" w:line="300" w:lineRule="exact"/>
       </w:pPr>
       <w:r>
-        <w:t>Record these in the Tier-1 section of the CSV (separate columns; see CSV header).</w:t>
+        <w:t>Record these in T21RS_scores_tier1_verifiers.csv (one row per Tier-1 query; columns: factual_agreement_pct, citation_jaccard, llm_pmids_absent_from_synthesis, invalid_pmids_found, notes).</w:t>
       </w:r>
     </w:p>
     <w:p>

</xml_diff>